<commit_message>
Fase E documentada (números enmascarados), ajustes de la fase D en teléfono y documento de cambios v2.1
Co-Authored-By: Claude Opus 5.5 <noreply@anthropic.com>
</commit_message>
<xml_diff>
--- a/docs/Handyman_Cambios_y_Mejoras_v2.docx
+++ b/docs/Handyman_Cambios_y_Mejoras_v2.docx
@@ -426,7 +426,7 @@
                 <w:sz w:val="18"/>
                 <w:szCs w:val="18"/>
               </w:rPr>
-              <w:t xml:space="preserve">25 de octubre de 2026</w:t>
+              <w:t xml:space="preserve">27 de octubre de 2026</w:t>
             </w:r>
           </w:p>
         </w:tc>
@@ -495,7 +495,7 @@
                 <w:sz w:val="18"/>
                 <w:szCs w:val="18"/>
               </w:rPr>
-              <w:t xml:space="preserve">2.0 — incluye el plan de cambios de la versión 2 (documento editable por el equipo)</w:t>
+              <w:t xml:space="preserve">2.1 — versión 2 implementada y publicada (documento editable por el equipo)</w:t>
             </w:r>
           </w:p>
         </w:tc>
@@ -841,7 +841,7 @@
           <w:sz w:val="20"/>
           <w:szCs w:val="20"/>
         </w:rPr>
-        <w:t xml:space="preserve">Versión 2 en desarrollo.</w:t>
+        <w:t xml:space="preserve">Versión 2 publicada.</w:t>
       </w:r>
       <w:r>
         <w:rPr>
@@ -850,7 +850,7 @@
           <w:sz w:val="20"/>
           <w:szCs w:val="20"/>
         </w:rPr>
-        <w:t xml:space="preserve"> La mensajería dentro de la plataforma ya está construida y probada localmente; el resto está planificado (sección 4).</w:t>
+        <w:t xml:space="preserve"> Las cinco fases (mensajería, centro de soporte, urgencias, simplicidad y llamadas) están en línea en handyman-gt.vercel.app (sección 4).</w:t>
       </w:r>
     </w:p>
     <w:p>
@@ -2572,7 +2572,7 @@
           <w:sz w:val="20"/>
           <w:szCs w:val="20"/>
         </w:rPr>
-        <w:t xml:space="preserve">Cada sugerencia se comparó con lo que la plataforma ya tenía para no hacer cambios innecesarios. Las que se resuelven con la versión 2 aparecen marcadas como "En desarrollo" o "Planificado".</w:t>
+        <w:t xml:space="preserve">Cada sugerencia se comparó con lo que la plataforma ya tenía para no hacer cambios innecesarios. Las que resolvió la versión 2 aparecen como "Implementado"; las demás quedan en la hoja de ruta.</w:t>
       </w:r>
     </w:p>
     <w:tbl>
@@ -3144,29 +3144,29 @@
               <w:bottom w:val="single" w:color="E1E5EE" w:sz="4"/>
               <w:right w:val="single" w:color="E1E5EE" w:sz="4"/>
             </w:tcBorders>
-            <w:shd w:fill="EDF1FD" w:color="auto" w:val="clear"/>
-            <w:tcMar>
-              <w:top w:type="dxa" w:w="90"/>
-              <w:left w:type="dxa" w:w="120"/>
-              <w:bottom w:type="dxa" w:w="90"/>
-              <w:right w:type="dxa" w:w="120"/>
-            </w:tcMar>
-            <w:vAlign w:val="top"/>
-          </w:tcPr>
-          <w:p>
-            <w:pPr>
-              <w:spacing w:after="40"/>
-            </w:pPr>
-            <w:r>
-              <w:rPr>
-                <w:rFonts w:ascii="Arial" w:cs="Arial" w:eastAsia="Arial" w:hAnsi="Arial"/>
-                <w:b/>
-                <w:bCs/>
-                <w:color w:val="233A8A"/>
+            <w:shd w:fill="E6F5EC" w:color="auto" w:val="clear"/>
+            <w:tcMar>
+              <w:top w:type="dxa" w:w="90"/>
+              <w:left w:type="dxa" w:w="120"/>
+              <w:bottom w:type="dxa" w:w="90"/>
+              <w:right w:type="dxa" w:w="120"/>
+            </w:tcMar>
+            <w:vAlign w:val="top"/>
+          </w:tcPr>
+          <w:p>
+            <w:pPr>
+              <w:spacing w:after="40"/>
+            </w:pPr>
+            <w:r>
+              <w:rPr>
+                <w:rFonts w:ascii="Arial" w:cs="Arial" w:eastAsia="Arial" w:hAnsi="Arial"/>
+                <w:b/>
+                <w:bCs/>
+                <w:color w:val="12733F"/>
                 <w:sz w:val="16"/>
                 <w:szCs w:val="16"/>
               </w:rPr>
-              <w:t xml:space="preserve">En desarrollo</w:t>
+              <w:t xml:space="preserve">Implementado</w:t>
             </w:r>
           </w:p>
           <w:p>
@@ -3180,7 +3180,7 @@
                 <w:sz w:val="16"/>
                 <w:szCs w:val="16"/>
               </w:rPr>
-              <w:t xml:space="preserve">Ver versión 2 (fase B)</w:t>
+              <w:t xml:space="preserve">Versión 2 (fase B)</w:t>
             </w:r>
           </w:p>
         </w:tc>
@@ -3608,7 +3608,7 @@
                 <w:sz w:val="16"/>
                 <w:szCs w:val="16"/>
               </w:rPr>
-              <w:t xml:space="preserve">Planificado</w:t>
+              <w:t xml:space="preserve">En parte</w:t>
             </w:r>
           </w:p>
           <w:p>
@@ -3622,7 +3622,7 @@
                 <w:sz w:val="16"/>
                 <w:szCs w:val="16"/>
               </w:rPr>
-              <w:t xml:space="preserve">Ver versión 2 (fase C)</w:t>
+              <w:t xml:space="preserve">Existe el evaluador técnico (fase C)</w:t>
             </w:r>
           </w:p>
         </w:tc>
@@ -3807,29 +3807,43 @@
               <w:bottom w:val="single" w:color="E1E5EE" w:sz="4"/>
               <w:right w:val="single" w:color="E1E5EE" w:sz="4"/>
             </w:tcBorders>
-            <w:shd w:fill="FDEBE9" w:color="auto" w:val="clear"/>
-            <w:tcMar>
-              <w:top w:type="dxa" w:w="90"/>
-              <w:left w:type="dxa" w:w="120"/>
-              <w:bottom w:type="dxa" w:w="90"/>
-              <w:right w:type="dxa" w:w="120"/>
-            </w:tcMar>
-            <w:vAlign w:val="top"/>
-          </w:tcPr>
-          <w:p>
-            <w:pPr>
-              <w:spacing w:after="40"/>
-            </w:pPr>
-            <w:r>
-              <w:rPr>
-                <w:rFonts w:ascii="Arial" w:cs="Arial" w:eastAsia="Arial" w:hAnsi="Arial"/>
-                <w:b/>
-                <w:bCs/>
-                <w:color w:val="B3261E"/>
+            <w:shd w:fill="FFF3D6" w:color="auto" w:val="clear"/>
+            <w:tcMar>
+              <w:top w:type="dxa" w:w="90"/>
+              <w:left w:type="dxa" w:w="120"/>
+              <w:bottom w:type="dxa" w:w="90"/>
+              <w:right w:type="dxa" w:w="120"/>
+            </w:tcMar>
+            <w:vAlign w:val="top"/>
+          </w:tcPr>
+          <w:p>
+            <w:pPr>
+              <w:spacing w:after="40"/>
+            </w:pPr>
+            <w:r>
+              <w:rPr>
+                <w:rFonts w:ascii="Arial" w:cs="Arial" w:eastAsia="Arial" w:hAnsi="Arial"/>
+                <w:b/>
+                <w:bCs/>
+                <w:color w:val="8F5A00"/>
                 <w:sz w:val="16"/>
                 <w:szCs w:val="16"/>
               </w:rPr>
-              <w:t xml:space="preserve">No existe</w:t>
+              <w:t xml:space="preserve">En parte</w:t>
+            </w:r>
+          </w:p>
+          <w:p>
+            <w:pPr>
+              <w:spacing w:after="40"/>
+            </w:pPr>
+            <w:r>
+              <w:rPr>
+                <w:rFonts w:ascii="Arial" w:cs="Arial" w:eastAsia="Arial" w:hAnsi="Arial"/>
+                <w:color w:val="434C63"/>
+                <w:sz w:val="16"/>
+                <w:szCs w:val="16"/>
+              </w:rPr>
+              <w:t xml:space="preserve">Estimador orientativo por oficio (fase C)</w:t>
             </w:r>
           </w:p>
         </w:tc>
@@ -4014,29 +4028,29 @@
               <w:bottom w:val="single" w:color="E1E5EE" w:sz="4"/>
               <w:right w:val="single" w:color="E1E5EE" w:sz="4"/>
             </w:tcBorders>
-            <w:shd w:fill="FFF3D6" w:color="auto" w:val="clear"/>
-            <w:tcMar>
-              <w:top w:type="dxa" w:w="90"/>
-              <w:left w:type="dxa" w:w="120"/>
-              <w:bottom w:type="dxa" w:w="90"/>
-              <w:right w:type="dxa" w:w="120"/>
-            </w:tcMar>
-            <w:vAlign w:val="top"/>
-          </w:tcPr>
-          <w:p>
-            <w:pPr>
-              <w:spacing w:after="40"/>
-            </w:pPr>
-            <w:r>
-              <w:rPr>
-                <w:rFonts w:ascii="Arial" w:cs="Arial" w:eastAsia="Arial" w:hAnsi="Arial"/>
-                <w:b/>
-                <w:bCs/>
-                <w:color w:val="8F5A00"/>
+            <w:shd w:fill="E6F5EC" w:color="auto" w:val="clear"/>
+            <w:tcMar>
+              <w:top w:type="dxa" w:w="90"/>
+              <w:left w:type="dxa" w:w="120"/>
+              <w:bottom w:type="dxa" w:w="90"/>
+              <w:right w:type="dxa" w:w="120"/>
+            </w:tcMar>
+            <w:vAlign w:val="top"/>
+          </w:tcPr>
+          <w:p>
+            <w:pPr>
+              <w:spacing w:after="40"/>
+            </w:pPr>
+            <w:r>
+              <w:rPr>
+                <w:rFonts w:ascii="Arial" w:cs="Arial" w:eastAsia="Arial" w:hAnsi="Arial"/>
+                <w:b/>
+                <w:bCs/>
+                <w:color w:val="12733F"/>
                 <w:sz w:val="16"/>
                 <w:szCs w:val="16"/>
               </w:rPr>
-              <w:t xml:space="preserve">Planificado</w:t>
+              <w:t xml:space="preserve">Implementado</w:t>
             </w:r>
           </w:p>
           <w:p>
@@ -4050,7 +4064,7 @@
                 <w:sz w:val="16"/>
                 <w:szCs w:val="16"/>
               </w:rPr>
-              <w:t xml:space="preserve">Ver versión 2 (fase C)</w:t>
+              <w:t xml:space="preserve">Versión 2 (fase C)</w:t>
             </w:r>
           </w:p>
         </w:tc>
@@ -4456,29 +4470,29 @@
               <w:bottom w:val="single" w:color="E1E5EE" w:sz="4"/>
               <w:right w:val="single" w:color="E1E5EE" w:sz="4"/>
             </w:tcBorders>
-            <w:shd w:fill="FFF3D6" w:color="auto" w:val="clear"/>
-            <w:tcMar>
-              <w:top w:type="dxa" w:w="90"/>
-              <w:left w:type="dxa" w:w="120"/>
-              <w:bottom w:type="dxa" w:w="90"/>
-              <w:right w:type="dxa" w:w="120"/>
-            </w:tcMar>
-            <w:vAlign w:val="top"/>
-          </w:tcPr>
-          <w:p>
-            <w:pPr>
-              <w:spacing w:after="40"/>
-            </w:pPr>
-            <w:r>
-              <w:rPr>
-                <w:rFonts w:ascii="Arial" w:cs="Arial" w:eastAsia="Arial" w:hAnsi="Arial"/>
-                <w:b/>
-                <w:bCs/>
-                <w:color w:val="8F5A00"/>
+            <w:shd w:fill="E6F5EC" w:color="auto" w:val="clear"/>
+            <w:tcMar>
+              <w:top w:type="dxa" w:w="90"/>
+              <w:left w:type="dxa" w:w="120"/>
+              <w:bottom w:type="dxa" w:w="90"/>
+              <w:right w:type="dxa" w:w="120"/>
+            </w:tcMar>
+            <w:vAlign w:val="top"/>
+          </w:tcPr>
+          <w:p>
+            <w:pPr>
+              <w:spacing w:after="40"/>
+            </w:pPr>
+            <w:r>
+              <w:rPr>
+                <w:rFonts w:ascii="Arial" w:cs="Arial" w:eastAsia="Arial" w:hAnsi="Arial"/>
+                <w:b/>
+                <w:bCs/>
+                <w:color w:val="12733F"/>
                 <w:sz w:val="16"/>
                 <w:szCs w:val="16"/>
               </w:rPr>
-              <w:t xml:space="preserve">Planificado</w:t>
+              <w:t xml:space="preserve">Implementado</w:t>
             </w:r>
           </w:p>
           <w:p>
@@ -4492,7 +4506,7 @@
                 <w:sz w:val="16"/>
                 <w:szCs w:val="16"/>
               </w:rPr>
-              <w:t xml:space="preserve">Ver versión 2 (fase D)</w:t>
+              <w:t xml:space="preserve">Versión 2 (fase D)</w:t>
             </w:r>
           </w:p>
         </w:tc>
@@ -4677,29 +4691,29 @@
               <w:bottom w:val="single" w:color="E1E5EE" w:sz="4"/>
               <w:right w:val="single" w:color="E1E5EE" w:sz="4"/>
             </w:tcBorders>
-            <w:shd w:fill="EDF1FD" w:color="auto" w:val="clear"/>
-            <w:tcMar>
-              <w:top w:type="dxa" w:w="90"/>
-              <w:left w:type="dxa" w:w="120"/>
-              <w:bottom w:type="dxa" w:w="90"/>
-              <w:right w:type="dxa" w:w="120"/>
-            </w:tcMar>
-            <w:vAlign w:val="top"/>
-          </w:tcPr>
-          <w:p>
-            <w:pPr>
-              <w:spacing w:after="40"/>
-            </w:pPr>
-            <w:r>
-              <w:rPr>
-                <w:rFonts w:ascii="Arial" w:cs="Arial" w:eastAsia="Arial" w:hAnsi="Arial"/>
-                <w:b/>
-                <w:bCs/>
-                <w:color w:val="233A8A"/>
+            <w:shd w:fill="FFF3D6" w:color="auto" w:val="clear"/>
+            <w:tcMar>
+              <w:top w:type="dxa" w:w="90"/>
+              <w:left w:type="dxa" w:w="120"/>
+              <w:bottom w:type="dxa" w:w="90"/>
+              <w:right w:type="dxa" w:w="120"/>
+            </w:tcMar>
+            <w:vAlign w:val="top"/>
+          </w:tcPr>
+          <w:p>
+            <w:pPr>
+              <w:spacing w:after="40"/>
+            </w:pPr>
+            <w:r>
+              <w:rPr>
+                <w:rFonts w:ascii="Arial" w:cs="Arial" w:eastAsia="Arial" w:hAnsi="Arial"/>
+                <w:b/>
+                <w:bCs/>
+                <w:color w:val="8F5A00"/>
                 <w:sz w:val="16"/>
                 <w:szCs w:val="16"/>
               </w:rPr>
-              <w:t xml:space="preserve">En desarrollo</w:t>
+              <w:t xml:space="preserve">En parte</w:t>
             </w:r>
           </w:p>
           <w:p>
@@ -4713,7 +4727,7 @@
                 <w:sz w:val="16"/>
                 <w:szCs w:val="16"/>
               </w:rPr>
-              <w:t xml:space="preserve">Avisos automáticos en el chat</w:t>
+              <w:t xml:space="preserve">Avisos en el chat y hora estimada de llegada</w:t>
             </w:r>
           </w:p>
         </w:tc>
@@ -4898,29 +4912,29 @@
               <w:bottom w:val="single" w:color="E1E5EE" w:sz="4"/>
               <w:right w:val="single" w:color="E1E5EE" w:sz="4"/>
             </w:tcBorders>
-            <w:shd w:fill="EDF1FD" w:color="auto" w:val="clear"/>
-            <w:tcMar>
-              <w:top w:type="dxa" w:w="90"/>
-              <w:left w:type="dxa" w:w="120"/>
-              <w:bottom w:type="dxa" w:w="90"/>
-              <w:right w:type="dxa" w:w="120"/>
-            </w:tcMar>
-            <w:vAlign w:val="top"/>
-          </w:tcPr>
-          <w:p>
-            <w:pPr>
-              <w:spacing w:after="40"/>
-            </w:pPr>
-            <w:r>
-              <w:rPr>
-                <w:rFonts w:ascii="Arial" w:cs="Arial" w:eastAsia="Arial" w:hAnsi="Arial"/>
-                <w:b/>
-                <w:bCs/>
-                <w:color w:val="233A8A"/>
+            <w:shd w:fill="E6F5EC" w:color="auto" w:val="clear"/>
+            <w:tcMar>
+              <w:top w:type="dxa" w:w="90"/>
+              <w:left w:type="dxa" w:w="120"/>
+              <w:bottom w:type="dxa" w:w="90"/>
+              <w:right w:type="dxa" w:w="120"/>
+            </w:tcMar>
+            <w:vAlign w:val="top"/>
+          </w:tcPr>
+          <w:p>
+            <w:pPr>
+              <w:spacing w:after="40"/>
+            </w:pPr>
+            <w:r>
+              <w:rPr>
+                <w:rFonts w:ascii="Arial" w:cs="Arial" w:eastAsia="Arial" w:hAnsi="Arial"/>
+                <w:b/>
+                <w:bCs/>
+                <w:color w:val="12733F"/>
                 <w:sz w:val="16"/>
                 <w:szCs w:val="16"/>
               </w:rPr>
-              <w:t xml:space="preserve">En desarrollo</w:t>
+              <w:t xml:space="preserve">Implementado</w:t>
             </w:r>
           </w:p>
           <w:p>
@@ -4934,7 +4948,7 @@
                 <w:sz w:val="16"/>
                 <w:szCs w:val="16"/>
               </w:rPr>
-              <w:t xml:space="preserve">Ver versión 2 (fases A y E)</w:t>
+              <w:t xml:space="preserve">Versión 2 (fases A y E)</w:t>
             </w:r>
           </w:p>
         </w:tc>
@@ -5715,7 +5729,7 @@
           <w:sz w:val="20"/>
           <w:szCs w:val="20"/>
         </w:rPr>
-        <w:t xml:space="preserve">La segunda ronda dejó una conclusión clara: la plataforma genera confianza, pero pierde valor cuando la persona tiene una emergencia o necesita resolver una duda rápido. La versión 2 ataca la rapidez, la comunicación y la facilidad de uso sin sacrificar la confianza.</w:t>
+        <w:t xml:space="preserve">La segunda ronda dejó una conclusión clara: la plataforma genera confianza, pero pierde valor cuando la persona tiene una emergencia o necesita resolver una duda rápido. La versión 2 ataca la rapidez, la comunicación y la facilidad de uso sin sacrificar la confianza. Las cinco fases ya están publicadas.</w:t>
       </w:r>
     </w:p>
     <w:tbl>
@@ -6017,7 +6031,7 @@
                 <w:sz w:val="17"/>
                 <w:szCs w:val="17"/>
               </w:rPr>
-              <w:t xml:space="preserve">Bandeja "Mensajes" con no leídos y avisos. Chat con cada profesional antes de contratar (reemplaza las preguntas y respuestas), chat de la orden con fotos, y "Pregúntale a Handyman". Los eventos de la orden aparecen como mensajes automáticos. Antes de contratar, teléfonos y correos se ocultan solos.</w:t>
+              <w:t xml:space="preserve">Bandeja "Mensajes" con no leídos y avisos. Chat con cada profesional antes de contratar, chat de la orden con fotos y "Pregúntale a Handyman". Los eventos de la orden aparecen como mensajes automáticos. Antes de contratar, teléfonos y correos se ocultan solos.</w:t>
             </w:r>
           </w:p>
         </w:tc>
@@ -6030,29 +6044,29 @@
               <w:bottom w:val="single" w:color="E1E5EE" w:sz="4"/>
               <w:right w:val="single" w:color="E1E5EE" w:sz="4"/>
             </w:tcBorders>
-            <w:shd w:fill="EDF1FD" w:color="auto" w:val="clear"/>
-            <w:tcMar>
-              <w:top w:type="dxa" w:w="90"/>
-              <w:left w:type="dxa" w:w="120"/>
-              <w:bottom w:type="dxa" w:w="90"/>
-              <w:right w:type="dxa" w:w="120"/>
-            </w:tcMar>
-            <w:vAlign w:val="top"/>
-          </w:tcPr>
-          <w:p>
-            <w:pPr>
-              <w:spacing w:after="40"/>
-            </w:pPr>
-            <w:r>
-              <w:rPr>
-                <w:rFonts w:ascii="Arial" w:cs="Arial" w:eastAsia="Arial" w:hAnsi="Arial"/>
-                <w:b/>
-                <w:bCs/>
-                <w:color w:val="233A8A"/>
+            <w:shd w:fill="E6F5EC" w:color="auto" w:val="clear"/>
+            <w:tcMar>
+              <w:top w:type="dxa" w:w="90"/>
+              <w:left w:type="dxa" w:w="120"/>
+              <w:bottom w:type="dxa" w:w="90"/>
+              <w:right w:type="dxa" w:w="120"/>
+            </w:tcMar>
+            <w:vAlign w:val="top"/>
+          </w:tcPr>
+          <w:p>
+            <w:pPr>
+              <w:spacing w:after="40"/>
+            </w:pPr>
+            <w:r>
+              <w:rPr>
+                <w:rFonts w:ascii="Arial" w:cs="Arial" w:eastAsia="Arial" w:hAnsi="Arial"/>
+                <w:b/>
+                <w:bCs/>
+                <w:color w:val="12733F"/>
                 <w:sz w:val="16"/>
                 <w:szCs w:val="16"/>
               </w:rPr>
-              <w:t xml:space="preserve">En desarrollo</w:t>
+              <w:t xml:space="preserve">Implementado</w:t>
             </w:r>
           </w:p>
         </w:tc>
@@ -6084,7 +6098,7 @@
                 <w:sz w:val="16"/>
                 <w:szCs w:val="16"/>
               </w:rPr>
-              <w:t xml:space="preserve">Construido y probado en local; falta publicarlo.</w:t>
+              <w:t xml:space="preserve">Publicado.</w:t>
             </w:r>
           </w:p>
         </w:tc>
@@ -6189,7 +6203,7 @@
                 <w:sz w:val="17"/>
                 <w:szCs w:val="17"/>
               </w:rPr>
-              <w:t xml:space="preserve">Botón "Necesito ayuda" en cada orden y garantía, con número de caso y agente asignado. Tiempo de respuesta visible y escalamiento si se vence. Mediación entre cliente, profesional y agente con acuerdo final aceptado por ambas partes. Bandeja de soporte para administración y página "Centro de ayuda".</w:t>
+              <w:t xml:space="preserve">Cada incidencia o garantía abre un caso con número, agente asignado automáticamente (el de menor carga) y tiempo de respuesta garantizado: urgente 1 h, alta 4 h, normal 24 h, con botón para escalar. Sala de mediación con cliente, profesional y agente; el agente propone un acuerdo y el caso se cierra cuando ambas partes lo aceptan. Panel "Centro de soporte" con cola, casos vencidos y tiempos promedio, y página pública "Centro de ayuda" (/ayuda).</w:t>
             </w:r>
           </w:p>
         </w:tc>
@@ -6202,29 +6216,29 @@
               <w:bottom w:val="single" w:color="E1E5EE" w:sz="4"/>
               <w:right w:val="single" w:color="E1E5EE" w:sz="4"/>
             </w:tcBorders>
-            <w:shd w:fill="EDF1FD" w:color="auto" w:val="clear"/>
-            <w:tcMar>
-              <w:top w:type="dxa" w:w="90"/>
-              <w:left w:type="dxa" w:w="120"/>
-              <w:bottom w:type="dxa" w:w="90"/>
-              <w:right w:type="dxa" w:w="120"/>
-            </w:tcMar>
-            <w:vAlign w:val="top"/>
-          </w:tcPr>
-          <w:p>
-            <w:pPr>
-              <w:spacing w:after="40"/>
-            </w:pPr>
-            <w:r>
-              <w:rPr>
-                <w:rFonts w:ascii="Arial" w:cs="Arial" w:eastAsia="Arial" w:hAnsi="Arial"/>
-                <w:b/>
-                <w:bCs/>
-                <w:color w:val="233A8A"/>
+            <w:shd w:fill="E6F5EC" w:color="auto" w:val="clear"/>
+            <w:tcMar>
+              <w:top w:type="dxa" w:w="90"/>
+              <w:left w:type="dxa" w:w="120"/>
+              <w:bottom w:type="dxa" w:w="90"/>
+              <w:right w:type="dxa" w:w="120"/>
+            </w:tcMar>
+            <w:vAlign w:val="top"/>
+          </w:tcPr>
+          <w:p>
+            <w:pPr>
+              <w:spacing w:after="40"/>
+            </w:pPr>
+            <w:r>
+              <w:rPr>
+                <w:rFonts w:ascii="Arial" w:cs="Arial" w:eastAsia="Arial" w:hAnsi="Arial"/>
+                <w:b/>
+                <w:bCs/>
+                <w:color w:val="12733F"/>
                 <w:sz w:val="16"/>
                 <w:szCs w:val="16"/>
               </w:rPr>
-              <w:t xml:space="preserve">En desarrollo</w:t>
+              <w:t xml:space="preserve">Implementado</w:t>
             </w:r>
           </w:p>
         </w:tc>
@@ -6256,7 +6270,7 @@
                 <w:sz w:val="16"/>
                 <w:szCs w:val="16"/>
               </w:rPr>
-              <w:t xml:space="preserve">Ya existen "Pregúntale a Handyman" y "Necesito ayuda con esta orden" sobre el chat; falta el panel de casos con tiempos.</w:t>
+              <w:t xml:space="preserve">Publicado. Probado de punta a punta: propuesta, aceptación de ambas partes y cierre.</w:t>
             </w:r>
           </w:p>
         </w:tc>
@@ -6361,7 +6375,7 @@
                 <w:sz w:val="17"/>
                 <w:szCs w:val="17"/>
               </w:rPr>
-              <w:t xml:space="preserve">Botón "Tengo una emergencia" (menos de 30 segundos), tarifa de visita fija visible y primeros auxilios mientras llega el profesional. Un evaluador de Handyman confirma la gravedad y el rango de precio. Despacho al primer profesional "Disponible ahora" de la zona, con hora estimada. Cotización en el lugar que el cliente aprueba antes del trabajo.</w:t>
+              <w:t xml:space="preserve">Botón rojo "Emergencia": se elige qué pasó con un toque, la dirección se precarga y se muestran primeros auxilios. Visita de diagnóstico a precio fijo (Q 150). Se avisa primero a los profesionales "Disponibles ahora" de la zona; el primero que acepta indica su hora de llegada. El presupuesto del trabajo se envía en sitio y el cliente lo aprueba. "Olor a gas" no despacha: muestra los números de bomberos (122 y 123). Evaluador técnico de Handyman y estimador orientativo de precio en cada solicitud.</w:t>
             </w:r>
           </w:p>
         </w:tc>
@@ -6374,29 +6388,29 @@
               <w:bottom w:val="single" w:color="E1E5EE" w:sz="4"/>
               <w:right w:val="single" w:color="E1E5EE" w:sz="4"/>
             </w:tcBorders>
-            <w:shd w:fill="FFF3D6" w:color="auto" w:val="clear"/>
-            <w:tcMar>
-              <w:top w:type="dxa" w:w="90"/>
-              <w:left w:type="dxa" w:w="120"/>
-              <w:bottom w:type="dxa" w:w="90"/>
-              <w:right w:type="dxa" w:w="120"/>
-            </w:tcMar>
-            <w:vAlign w:val="top"/>
-          </w:tcPr>
-          <w:p>
-            <w:pPr>
-              <w:spacing w:after="40"/>
-            </w:pPr>
-            <w:r>
-              <w:rPr>
-                <w:rFonts w:ascii="Arial" w:cs="Arial" w:eastAsia="Arial" w:hAnsi="Arial"/>
-                <w:b/>
-                <w:bCs/>
-                <w:color w:val="8F5A00"/>
+            <w:shd w:fill="E6F5EC" w:color="auto" w:val="clear"/>
+            <w:tcMar>
+              <w:top w:type="dxa" w:w="90"/>
+              <w:left w:type="dxa" w:w="120"/>
+              <w:bottom w:type="dxa" w:w="90"/>
+              <w:right w:type="dxa" w:w="120"/>
+            </w:tcMar>
+            <w:vAlign w:val="top"/>
+          </w:tcPr>
+          <w:p>
+            <w:pPr>
+              <w:spacing w:after="40"/>
+            </w:pPr>
+            <w:r>
+              <w:rPr>
+                <w:rFonts w:ascii="Arial" w:cs="Arial" w:eastAsia="Arial" w:hAnsi="Arial"/>
+                <w:b/>
+                <w:bCs/>
+                <w:color w:val="12733F"/>
                 <w:sz w:val="16"/>
                 <w:szCs w:val="16"/>
               </w:rPr>
-              <w:t xml:space="preserve">Planificado</w:t>
+              <w:t xml:space="preserve">Implementado</w:t>
             </w:r>
           </w:p>
         </w:tc>
@@ -6428,7 +6442,7 @@
                 <w:sz w:val="16"/>
                 <w:szCs w:val="16"/>
               </w:rPr>
-              <w:t xml:space="preserve">Responde al feedback de que en una emergencia nadie quiere esperar 2 o 3 horas.</w:t>
+              <w:t xml:space="preserve">Publicado. El estimador es una regla por oficio y palabras clave, no un precio final.</w:t>
             </w:r>
           </w:p>
         </w:tc>
@@ -6533,7 +6547,7 @@
                 <w:sz w:val="17"/>
                 <w:szCs w:val="17"/>
               </w:rPr>
-              <w:t xml:space="preserve">Asistente guiado de una pregunta por pantalla con íconos grandes, tutorial la primera vez (cliente y profesional), ayuda "?" en lo que confunde, opción de letra grande e inicio con dos caminos claros: Emergencia o Planificar un trabajo.</w:t>
+              <w:t xml:space="preserve">Inicio con dos botones grandes: Emergencia o Planificar un trabajo. Asistente por pasos que avanza con un toque, dictado por voz y fechas rápidas (hoy, mañana, sábado). Tutorial la primera vez (cliente y profesional), ayuda "?" en los pasos que confunden y botón de letra grande.</w:t>
             </w:r>
           </w:p>
         </w:tc>
@@ -6546,29 +6560,29 @@
               <w:bottom w:val="single" w:color="E1E5EE" w:sz="4"/>
               <w:right w:val="single" w:color="E1E5EE" w:sz="4"/>
             </w:tcBorders>
-            <w:shd w:fill="FFF3D6" w:color="auto" w:val="clear"/>
-            <w:tcMar>
-              <w:top w:type="dxa" w:w="90"/>
-              <w:left w:type="dxa" w:w="120"/>
-              <w:bottom w:type="dxa" w:w="90"/>
-              <w:right w:type="dxa" w:w="120"/>
-            </w:tcMar>
-            <w:vAlign w:val="top"/>
-          </w:tcPr>
-          <w:p>
-            <w:pPr>
-              <w:spacing w:after="40"/>
-            </w:pPr>
-            <w:r>
-              <w:rPr>
-                <w:rFonts w:ascii="Arial" w:cs="Arial" w:eastAsia="Arial" w:hAnsi="Arial"/>
-                <w:b/>
-                <w:bCs/>
-                <w:color w:val="8F5A00"/>
+            <w:shd w:fill="E6F5EC" w:color="auto" w:val="clear"/>
+            <w:tcMar>
+              <w:top w:type="dxa" w:w="90"/>
+              <w:left w:type="dxa" w:w="120"/>
+              <w:bottom w:type="dxa" w:w="90"/>
+              <w:right w:type="dxa" w:w="120"/>
+            </w:tcMar>
+            <w:vAlign w:val="top"/>
+          </w:tcPr>
+          <w:p>
+            <w:pPr>
+              <w:spacing w:after="40"/>
+            </w:pPr>
+            <w:r>
+              <w:rPr>
+                <w:rFonts w:ascii="Arial" w:cs="Arial" w:eastAsia="Arial" w:hAnsi="Arial"/>
+                <w:b/>
+                <w:bCs/>
+                <w:color w:val="12733F"/>
                 <w:sz w:val="16"/>
                 <w:szCs w:val="16"/>
               </w:rPr>
-              <w:t xml:space="preserve">Planificado</w:t>
+              <w:t xml:space="preserve">Implementado</w:t>
             </w:r>
           </w:p>
         </w:tc>
@@ -6600,7 +6614,7 @@
                 <w:sz w:val="16"/>
                 <w:szCs w:val="16"/>
               </w:rPr>
-              <w:t xml:space="preserve">Para personas con poca experiencia en apps.</w:t>
+              <w:t xml:space="preserve">Publicado. Revisado en teléfono y con letra grande.</w:t>
             </w:r>
           </w:p>
         </w:tc>
@@ -6705,7 +6719,7 @@
                 <w:sz w:val="17"/>
                 <w:szCs w:val="17"/>
               </w:rPr>
-              <w:t xml:space="preserve">Botón "Llamar" en el chat de una orden activa (marca al teléfono del otro participante) y "Llamar a Handyman" a la línea de soporte. Antes de contratar no hay llamadas, solo chat.</w:t>
+              <w:t xml:space="preserve">Botón "Llamar" en la orden y su chat mientras la orden está activa, y "Llamar a Handyman" en soporte, mediación, emergencias y el Centro de ayuda. Antes de contratar no hay llamadas, solo chat.</w:t>
             </w:r>
           </w:p>
         </w:tc>
@@ -6718,29 +6732,29 @@
               <w:bottom w:val="single" w:color="E1E5EE" w:sz="4"/>
               <w:right w:val="single" w:color="E1E5EE" w:sz="4"/>
             </w:tcBorders>
-            <w:shd w:fill="EDF1FD" w:color="auto" w:val="clear"/>
-            <w:tcMar>
-              <w:top w:type="dxa" w:w="90"/>
-              <w:left w:type="dxa" w:w="120"/>
-              <w:bottom w:type="dxa" w:w="90"/>
-              <w:right w:type="dxa" w:w="120"/>
-            </w:tcMar>
-            <w:vAlign w:val="top"/>
-          </w:tcPr>
-          <w:p>
-            <w:pPr>
-              <w:spacing w:after="40"/>
-            </w:pPr>
-            <w:r>
-              <w:rPr>
-                <w:rFonts w:ascii="Arial" w:cs="Arial" w:eastAsia="Arial" w:hAnsi="Arial"/>
-                <w:b/>
-                <w:bCs/>
-                <w:color w:val="233A8A"/>
+            <w:shd w:fill="E6F5EC" w:color="auto" w:val="clear"/>
+            <w:tcMar>
+              <w:top w:type="dxa" w:w="90"/>
+              <w:left w:type="dxa" w:w="120"/>
+              <w:bottom w:type="dxa" w:w="90"/>
+              <w:right w:type="dxa" w:w="120"/>
+            </w:tcMar>
+            <w:vAlign w:val="top"/>
+          </w:tcPr>
+          <w:p>
+            <w:pPr>
+              <w:spacing w:after="40"/>
+            </w:pPr>
+            <w:r>
+              <w:rPr>
+                <w:rFonts w:ascii="Arial" w:cs="Arial" w:eastAsia="Arial" w:hAnsi="Arial"/>
+                <w:b/>
+                <w:bCs/>
+                <w:color w:val="12733F"/>
                 <w:sz w:val="16"/>
                 <w:szCs w:val="16"/>
               </w:rPr>
-              <w:t xml:space="preserve">En desarrollo</w:t>
+              <w:t xml:space="preserve">Implementado</w:t>
             </w:r>
           </w:p>
         </w:tc>
@@ -6772,7 +6786,7 @@
                 <w:sz w:val="16"/>
                 <w:szCs w:val="16"/>
               </w:rPr>
-              <w:t xml:space="preserve">Botón incluido en el chat. Para producción: número enmascarado (Twilio u otro proveedor).</w:t>
+              <w:t xml:space="preserve">Para producción: números enmascarados con un proveedor de telefonía (docs/fase-e-llamadas.md).</w:t>
             </w:r>
           </w:p>
         </w:tc>
@@ -6839,7 +6853,7 @@
                 <w:sz w:val="19"/>
                 <w:szCs w:val="19"/>
               </w:rPr>
-              <w:t xml:space="preserve">el carril de urgencias necesita suficientes profesionales "disponibles ahora" por zona. Conviene iniciar con plomería, electricidad y cerrajería en pocas zonas.</w:t>
+              <w:t xml:space="preserve">el carril de urgencias necesita suficientes profesionales "disponibles ahora" por zona. Conviene iniciar con plomería, electricidad y cerrajería en pocas zonas; si nadie acepta en 10 minutos, la pantalla de espera ofrece llamar a la línea de Handyman.</w:t>
             </w:r>
           </w:p>
         </w:tc>
@@ -6927,7 +6941,7 @@
                 <w:sz w:val="18"/>
                 <w:szCs w:val="18"/>
               </w:rPr>
-              <w:t xml:space="preserve">En reparaciones el precio real casi nunca se sabe por una foto (un empaque de Q50 o una tubería de Q1,500). Si la IA se equivoca, nadie acepta o el cliente siente que le cobran de más. La IA se usa como estimadora y para prellenar cotizaciones; el precio final lo confirma una persona.</w:t>
+              <w:t xml:space="preserve">En reparaciones el precio real casi nunca se sabe por una foto (un empaque de Q50 o una tubería de Q1,500). Si la IA se equivoca, nadie acepta o el cliente siente que le cobran de más. Por eso el estimador automático solo muestra un rango orientativo y el precio final lo confirma una persona.</w:t>
             </w:r>
           </w:p>
         </w:tc>
@@ -7062,21 +7076,21 @@
                 <w:sz w:val="20"/>
                 <w:szCs w:val="20"/>
               </w:rPr>
-              <w:t xml:space="preserve">Evaluador humano + IA</w:t>
-            </w:r>
-          </w:p>
-          <w:p>
-            <w:pPr>
-              <w:spacing w:after="40"/>
-            </w:pPr>
-            <w:r>
-              <w:rPr>
-                <w:rFonts w:ascii="Arial" w:cs="Arial" w:eastAsia="Arial" w:hAnsi="Arial"/>
-                <w:color w:val="434C63"/>
-                <w:sz w:val="18"/>
-                <w:szCs w:val="18"/>
-              </w:rPr>
-              <w:t xml:space="preserve">La IA hace el primer borrador (clasificación y rango de precio) y un evaluador de Handyman lo confirma en minutos. El mismo rol hace la inspección de calidad al terminar y atiende soporte.</w:t>
+              <w:t xml:space="preserve">Evaluador humano + estimador</w:t>
+            </w:r>
+          </w:p>
+          <w:p>
+            <w:pPr>
+              <w:spacing w:after="40"/>
+            </w:pPr>
+            <w:r>
+              <w:rPr>
+                <w:rFonts w:ascii="Arial" w:cs="Arial" w:eastAsia="Arial" w:hAnsi="Arial"/>
+                <w:color w:val="434C63"/>
+                <w:sz w:val="18"/>
+                <w:szCs w:val="18"/>
+              </w:rPr>
+              <w:t xml:space="preserve">El estimador automático da el primer rango de precio y, si el cliente lo pide, un evaluador de Handyman revisa fotos y relato por chat. El mismo rol atiende soporte y, más adelante, hará la inspección de calidad al terminar.</w:t>
             </w:r>
           </w:p>
         </w:tc>
@@ -8002,7 +8016,7 @@
           <w:sz w:val="17"/>
           <w:szCs w:val="17"/>
         </w:rPr>
-        <w:t xml:space="preserve">Cada fase se publica en handyman-gt.vercel.app al terminarla, para que el equipo pueda revisar avances sin esperar al final.</w:t>
+        <w:t xml:space="preserve">Las fases A a E ya están publicadas en handyman-gt.vercel.app. Lo siguiente son los pendientes de la primera ronda y los requisitos de producción.</w:t>
       </w:r>
     </w:p>
     <w:p>
@@ -8391,7 +8405,7 @@
                 <w:sz w:val="18"/>
                 <w:szCs w:val="18"/>
               </w:rPr>
-              <w:t xml:space="preserve">Administración</w:t>
+              <w:t xml:space="preserve">Administración (Lucía)</w:t>
             </w:r>
           </w:p>
         </w:tc>
@@ -8424,6 +8438,75 @@
                 <w:szCs w:val="18"/>
               </w:rPr>
               <w:t xml:space="preserve">admin@handyman.demo</w:t>
+            </w:r>
+          </w:p>
+        </w:tc>
+      </w:tr>
+      <w:tr>
+        <w:trPr>
+          <w:cantSplit/>
+        </w:trPr>
+        <w:tc>
+          <w:tcPr>
+            <w:tcW w:type="dxa" w:w="3500"/>
+            <w:tcBorders>
+              <w:top w:val="single" w:color="E1E5EE" w:sz="4"/>
+              <w:left w:val="single" w:color="E1E5EE" w:sz="4"/>
+              <w:bottom w:val="single" w:color="E1E5EE" w:sz="4"/>
+              <w:right w:val="single" w:color="E1E5EE" w:sz="4"/>
+            </w:tcBorders>
+            <w:tcMar>
+              <w:top w:type="dxa" w:w="40"/>
+              <w:left w:type="dxa" w:w="120"/>
+              <w:bottom w:type="dxa" w:w="40"/>
+              <w:right w:type="dxa" w:w="120"/>
+            </w:tcMar>
+            <w:vAlign w:val="top"/>
+          </w:tcPr>
+          <w:p>
+            <w:pPr>
+              <w:spacing w:after="40"/>
+            </w:pPr>
+            <w:r>
+              <w:rPr>
+                <w:rFonts w:ascii="Arial" w:cs="Arial" w:eastAsia="Arial" w:hAnsi="Arial"/>
+                <w:color w:val="434C63"/>
+                <w:sz w:val="18"/>
+                <w:szCs w:val="18"/>
+              </w:rPr>
+              <w:t xml:space="preserve">Soporte y evaluador (Jorge)</w:t>
+            </w:r>
+          </w:p>
+        </w:tc>
+        <w:tc>
+          <w:tcPr>
+            <w:tcW w:type="dxa" w:w="6580"/>
+            <w:tcBorders>
+              <w:top w:val="single" w:color="E1E5EE" w:sz="4"/>
+              <w:left w:val="single" w:color="E1E5EE" w:sz="4"/>
+              <w:bottom w:val="single" w:color="E1E5EE" w:sz="4"/>
+              <w:right w:val="single" w:color="E1E5EE" w:sz="4"/>
+            </w:tcBorders>
+            <w:tcMar>
+              <w:top w:type="dxa" w:w="40"/>
+              <w:left w:type="dxa" w:w="120"/>
+              <w:bottom w:type="dxa" w:w="40"/>
+              <w:right w:type="dxa" w:w="120"/>
+            </w:tcMar>
+            <w:vAlign w:val="top"/>
+          </w:tcPr>
+          <w:p>
+            <w:pPr>
+              <w:spacing w:after="40"/>
+            </w:pPr>
+            <w:r>
+              <w:rPr>
+                <w:rFonts w:ascii="Arial" w:cs="Arial" w:eastAsia="Arial" w:hAnsi="Arial"/>
+                <w:color w:val="434C63"/>
+                <w:sz w:val="18"/>
+                <w:szCs w:val="18"/>
+              </w:rPr>
+              <w:t xml:space="preserve">soporte@handyman.demo</w:t>
             </w:r>
           </w:p>
         </w:tc>
@@ -8629,6 +8712,73 @@
                 <w:szCs w:val="19"/>
               </w:rPr>
               <w:t xml:space="preserve">como cliente, comparar y aceptar una cotización, confirmar identidad con QR y aprobar un trabajo. Como administración, aprobar al profesional pendiente y resolver un caso.</w:t>
+            </w:r>
+          </w:p>
+        </w:tc>
+      </w:tr>
+    </w:tbl>
+    <w:p>
+      <w:pPr>
+        <w:spacing w:after="80"/>
+      </w:pPr>
+    </w:p>
+    <w:tbl>
+      <w:tblPr>
+        <w:tblW w:type="dxa" w:w="10080"/>
+        <w:tblBorders>
+          <w:top w:val="none" w:color="auto" w:sz="0"/>
+          <w:left w:val="none" w:color="auto" w:sz="0"/>
+          <w:bottom w:val="none" w:color="auto" w:sz="0"/>
+          <w:right w:val="none" w:color="auto" w:sz="0"/>
+          <w:insideH w:val="none" w:color="auto" w:sz="0"/>
+          <w:insideV w:val="none" w:color="auto" w:sz="0"/>
+        </w:tblBorders>
+      </w:tblPr>
+      <w:tblGrid>
+        <w:gridCol w:w="10080"/>
+      </w:tblGrid>
+      <w:tr>
+        <w:tc>
+          <w:tcPr>
+            <w:tcW w:type="dxa" w:w="10080"/>
+            <w:tcBorders>
+              <w:top w:val="none" w:sz="0"/>
+              <w:left w:val="none" w:sz="0"/>
+              <w:bottom w:val="none" w:sz="0"/>
+              <w:right w:val="none" w:sz="0"/>
+            </w:tcBorders>
+            <w:shd w:fill="EDF1FD" w:color="auto" w:val="clear"/>
+            <w:tcMar>
+              <w:top w:type="dxa" w:w="90"/>
+              <w:left w:type="dxa" w:w="120"/>
+              <w:bottom w:type="dxa" w:w="90"/>
+              <w:right w:type="dxa" w:w="120"/>
+            </w:tcMar>
+            <w:vAlign w:val="top"/>
+          </w:tcPr>
+          <w:p>
+            <w:pPr>
+              <w:spacing w:after="40"/>
+            </w:pPr>
+            <w:r>
+              <w:rPr>
+                <w:rFonts w:ascii="Arial" w:cs="Arial" w:eastAsia="Arial" w:hAnsi="Arial"/>
+                <w:b/>
+                <w:bCs/>
+                <w:color w:val="233A8A"/>
+                <w:sz w:val="19"/>
+                <w:szCs w:val="19"/>
+              </w:rPr>
+              <w:t xml:space="preserve">Versión 2: </w:t>
+            </w:r>
+            <w:r>
+              <w:rPr>
+                <w:rFonts w:ascii="Arial" w:cs="Arial" w:eastAsia="Arial" w:hAnsi="Arial"/>
+                <w:color w:val="233A8A"/>
+                <w:sz w:val="19"/>
+                <w:szCs w:val="19"/>
+              </w:rPr>
+              <w:t xml:space="preserve">como Andrea, tocar "Emergencia" → "Fuga de agua" → "Pedir ayuda ahora"; luego, como Carlos (plomero@handyman.demo), aceptar la emergencia con su hora de llegada. Como Lucía, abrir "Centro de soporte", entrar a un caso, proponer un acuerdo y aceptarlo como Roberto y como el profesional desde la sala de mediación.</w:t>
             </w:r>
           </w:p>
         </w:tc>

</xml_diff>